<commit_message>
Record source ZIP startup and verified credential-free acceptance archive
</commit_message>
<xml_diff>
--- a/docs/twenty-sixth-round-delivery-report.docx
+++ b/docs/twenty-sixth-round-delivery-report.docx
@@ -882,6 +882,11 @@
         <w:t>云环境启动指引已保存为配置草稿，安装脚本、网络限制和既有 Secret 绑定保持不变；保存不代表应用或发布。若希望后续云任务采用更新指引，在环境设置中审核、保存，再发布环境。不会等待此操作来交付当前文件；也不会将其当作对外部署。</w:t>
       </w:r>
     </w:p>
+    <w:p>
+      <w:r>
+        <w:t>源码 ZIP 已在独立临时目录实际解压，在不含 .git 的情况下完成 npm ci、npm run build、初始化三个固定账号并启动构建页面；health 与 HTML 验证通过，没有调用模型。证据见 archive-build-startup.json。此安装验证不代表目标服务器 HTTPS／systemd 部署已经执行。</w:t>
+      </w:r>
+    </w:p>
     <w:sectPr>
       <w:headerReference w:type="default" r:id="rId9"/>
       <w:footerReference w:type="default" r:id="rId10"/>

</xml_diff>